<commit_message>
Implement Offline extraction system upgrades
</commit_message>
<xml_diff>
--- a/backend/storage/generated_reports/valuation_report.docx
+++ b/backend/storage/generated_reports/valuation_report.docx
@@ -50,6 +50,7 @@
                 <w:b/>
                 <w:bCs/>
               </w:rPr>
+              <w:t>M Pavan Kumar</w:t>
             </w:r>
           </w:p>
         </w:tc>
@@ -101,7 +102,7 @@
                 <w:b/>
                 <w:bCs/>
               </w:rPr>
-              <w:t>77,BHANOOR VILLAGE</w:t>
+              <w:t>147852963</w:t>
             </w:r>
           </w:p>
         </w:tc>
@@ -205,6 +206,7 @@
                 <w:b/>
                 <w:bCs/>
               </w:rPr>
+              <w:t>9-148</w:t>
             </w:r>
           </w:p>
         </w:tc>
@@ -256,7 +258,7 @@
                 <w:b/>
                 <w:bCs/>
               </w:rPr>
-              <w:t>HYDERABAD Medak TG 502305 IN.And Rep.by</w:t>
+              <w:t>HYDERABAD Medak</w:t>
             </w:r>
           </w:p>
         </w:tc>
@@ -308,7 +310,7 @@
                 <w:b/>
                 <w:bCs/>
               </w:rPr>
-              <w:t>50oo89 Telangana State</w:t>
+              <w:t>Telangana State</w:t>
             </w:r>
           </w:p>
         </w:tc>

</xml_diff>